<commit_message>
OpenShell: the model meets the shipped supervisor-middleware contract (reason-code grammar, hold as denial with a once-only approved retry, nothing but the code to the sandbox); five tests; Part 5 says how the chip plugs into OpenShell
The contract was read from NVIDIA/OpenShell docs/extensibility/supervisor-middleware at main 837fdfd (21 Oct 2026) and recorded in docs/NVIDIA.md. Em dashes removed from oasp.py and NVIDIA.md. Suite is 56 tests; catalogue unchanged at 75 + 12.

Co-Authored-By: Claude Fable 5.1 <noreply@anthropic.com>
Claude-Session: https://claude.ai/code/session_01DkQpVYNjMdJtfzj74tR8ZC
</commit_message>
<xml_diff>
--- a/blog/04-the-chip-that-says-no-3-the-silicon-design.docx
+++ b/blog/04-the-chip-that-says-no-3-the-silicon-design.docx
@@ -34,7 +34,7 @@
         <w:spacing w:after="240" w:before="120" w:line="276" w:lineRule="auto"/>
         <w:ind w:left="360"/>
       </w:pPr>
-      <w:hyperlink w:history="1" r:id="rIdt2qhnutdd9ajoie_9ytr5">
+      <w:hyperlink w:history="1" r:id="rId70xv0hxahm8h4lpvh-isx">
         <w:r>
           <w:rPr>
             <w:rStyle w:val="Hyperlink"/>
@@ -57,7 +57,7 @@
         </w:rPr>
         <w:t xml:space="preserve"> and </w:t>
       </w:r>
-      <w:hyperlink w:history="1" r:id="rId8wp7keaqxpmrahevwgqax">
+      <w:hyperlink w:history="1" r:id="rIddgym8etz5x7uuwthjkoxy">
         <w:r>
           <w:rPr>
             <w:rStyle w:val="Hyperlink"/>
@@ -80,7 +80,7 @@
         </w:rPr>
         <w:t xml:space="preserve"> made the argument. </w:t>
       </w:r>
-      <w:hyperlink w:history="1" r:id="rId507_r0a4mvcalurnjhq-0">
+      <w:hyperlink w:history="1" r:id="rIdxuhnepnjh4q9jmcxx16hs">
         <w:r>
           <w:rPr>
             <w:rStyle w:val="Hyperlink"/>
@@ -103,7 +103,7 @@
         </w:rPr>
         <w:t xml:space="preserve"> laid out the layer model and shipped the reference stack. This post and the next are the design that post promised. This one is the action side: the contract, where the walls are, what a chip can and cannot know, where the bits live, and the gate, the ticket and the comparator that make up the primary guarantee. </w:t>
       </w:r>
-      <w:hyperlink w:history="1" r:id="rIdek0ex8ap-zz46ordd5psx">
+      <w:hyperlink w:history="1" r:id="rId_hzwa4ktyal0lokxsjva6">
         <w:r>
           <w:rPr>
             <w:rStyle w:val="Hyperlink"/>
@@ -380,7 +380,7 @@
             <w:pPr>
               <w:spacing w:after="0" w:line="252" w:lineRule="auto"/>
             </w:pPr>
-            <w:hyperlink w:history="1" r:id="rId4-wwfxqldof8kwjxaqeg0">
+            <w:hyperlink w:history="1" r:id="rId80ocp8wcraevxte5usful">
               <w:r>
                 <w:rPr>
                   <w:rStyle w:val="Hyperlink"/>
@@ -401,7 +401,7 @@
               </w:rPr>
               <w:t xml:space="preserve"> (</w:t>
             </w:r>
-            <w:hyperlink w:history="1" r:id="rIdrozel75cq7sq2mb6z08jd">
+            <w:hyperlink w:history="1" r:id="rIdpavizdjyaldysrxti5ue2">
               <w:r>
                 <w:rPr>
                   <w:rStyle w:val="Hyperlink"/>
@@ -503,7 +503,7 @@
               </w:rPr>
               <w:t xml:space="preserve">this repo (</w:t>
             </w:r>
-            <w:hyperlink w:history="1" r:id="rIdtt4miuptvlghgrq5gxrfu">
+            <w:hyperlink w:history="1" r:id="rIdu3vgrnooq2rz8gwhhlu09">
               <w:r>
                 <w:rPr>
                   <w:rStyle w:val="Hyperlink"/>
@@ -524,7 +524,7 @@
               </w:rPr>
               <w:t xml:space="preserve">, </w:t>
             </w:r>
-            <w:hyperlink w:history="1" r:id="rIdrwcg4pg2iazxov1syo9s8">
+            <w:hyperlink w:history="1" r:id="rIdieqf9a3hgkunotlzmfgxb">
               <w:r>
                 <w:rPr>
                   <w:rStyle w:val="Hyperlink"/>
@@ -545,7 +545,7 @@
               </w:rPr>
               <w:t xml:space="preserve">, </w:t>
             </w:r>
-            <w:hyperlink w:history="1" r:id="rIdfv41vmecxc-rsvm1y7n2g">
+            <w:hyperlink w:history="1" r:id="rId3jneyzfeypizzqlgpqnky">
               <w:r>
                 <w:rPr>
                   <w:rStyle w:val="Hyperlink"/>
@@ -566,7 +566,7 @@
               </w:rPr>
               <w:t xml:space="preserve">, </w:t>
             </w:r>
-            <w:hyperlink w:history="1" r:id="rId_-9gwzynhnq4y8vjmwi5b">
+            <w:hyperlink w:history="1" r:id="rIdtjpyia44u2x8lxe4u6gis">
               <w:r>
                 <w:rPr>
                   <w:rStyle w:val="Hyperlink"/>
@@ -659,7 +659,7 @@
             <w:pPr>
               <w:spacing w:after="0" w:line="252" w:lineRule="auto"/>
             </w:pPr>
-            <w:hyperlink w:history="1" r:id="rIdqtixjk0mjnjdkscgepzaw">
+            <w:hyperlink w:history="1" r:id="rIdpjjottc-3vhbbjodxbu5v">
               <w:r>
                 <w:rPr>
                   <w:rStyle w:val="Hyperlink"/>
@@ -680,7 +680,7 @@
               </w:rPr>
               <w:t xml:space="preserve">; </w:t>
             </w:r>
-            <w:hyperlink w:history="1" r:id="rIdq8rprktscgtgz3btnlhvh">
+            <w:hyperlink w:history="1" r:id="rIdstek7uctli_ji-ak-rhqg">
               <w:r>
                 <w:rPr>
                   <w:rStyle w:val="Hyperlink"/>
@@ -764,7 +764,7 @@
             <w:pPr>
               <w:spacing w:after="0" w:line="252" w:lineRule="auto"/>
             </w:pPr>
-            <w:hyperlink w:history="1" r:id="rIdirmuuekv2xzyhfnb7kmsr">
+            <w:hyperlink w:history="1" r:id="rIdchopogbg5sfhs6h15bvsf">
               <w:r>
                 <w:rPr>
                   <w:rStyle w:val="Hyperlink"/>
@@ -938,7 +938,7 @@
               </w:rPr>
               <w:t xml:space="preserve">this repo (</w:t>
             </w:r>
-            <w:hyperlink w:history="1" r:id="rIdvsq4fj7sztrizsisanbas">
+            <w:hyperlink w:history="1" r:id="rId5cpmnnpcmpchqkk1dsafh">
               <w:r>
                 <w:rPr>
                   <w:rStyle w:val="Hyperlink"/>
@@ -1152,7 +1152,7 @@
             <w:pPr>
               <w:spacing w:after="0" w:line="252" w:lineRule="auto"/>
             </w:pPr>
-            <w:hyperlink w:history="1" r:id="rIdvc2hnskqbonvhkbkslzxy">
+            <w:hyperlink w:history="1" r:id="rIdmpgfvukh4ecqv2g31zdp3">
               <w:r>
                 <w:rPr>
                   <w:rStyle w:val="Hyperlink"/>
@@ -1236,7 +1236,7 @@
             <w:pPr>
               <w:spacing w:after="0" w:line="252" w:lineRule="auto"/>
             </w:pPr>
-            <w:hyperlink w:history="1" r:id="rIdkhk6z_x1fzhry9m3lhu4l">
+            <w:hyperlink w:history="1" r:id="rIdbi_ycspwldpv0zdtipide">
               <w:r>
                 <w:rPr>
                   <w:rStyle w:val="Hyperlink"/>
@@ -1257,7 +1257,7 @@
               </w:rPr>
               <w:t xml:space="preserve">, </w:t>
             </w:r>
-            <w:hyperlink w:history="1" r:id="rId46dipsnnn5fndu3zymnof">
+            <w:hyperlink w:history="1" r:id="rIdqttnibij9b_n44etgfnhz">
               <w:r>
                 <w:rPr>
                   <w:rStyle w:val="Hyperlink"/>
@@ -1341,7 +1341,7 @@
             <w:pPr>
               <w:spacing w:after="0" w:line="252" w:lineRule="auto"/>
             </w:pPr>
-            <w:hyperlink w:history="1" r:id="rIduc9fmorkefz38_cmr-9g1">
+            <w:hyperlink w:history="1" r:id="rIdnzofneyq-7tyl8bd3me6z">
               <w:r>
                 <w:rPr>
                   <w:rStyle w:val="Hyperlink"/>
@@ -1362,7 +1362,7 @@
               </w:rPr>
               <w:t xml:space="preserve">, approvals in </w:t>
             </w:r>
-            <w:hyperlink w:history="1" r:id="rIdrbo7t_5lies-wbvytrqju">
+            <w:hyperlink w:history="1" r:id="rIdscwubxul3uesjg7dt-sfi">
               <w:r>
                 <w:rPr>
                   <w:rStyle w:val="Hyperlink"/>
@@ -1446,7 +1446,7 @@
             <w:pPr>
               <w:spacing w:after="0" w:line="252" w:lineRule="auto"/>
             </w:pPr>
-            <w:hyperlink w:history="1" r:id="rIdvut_ympavlll269zzb0qs">
+            <w:hyperlink w:history="1" r:id="rIdpq828o-yseouqb9kttux_">
               <w:r>
                 <w:rPr>
                   <w:rStyle w:val="Hyperlink"/>
@@ -1467,7 +1467,7 @@
               </w:rPr>
               <w:t xml:space="preserve">, </w:t>
             </w:r>
-            <w:hyperlink w:history="1" r:id="rIdi00vikqfsnwmiyptekq9r">
+            <w:hyperlink w:history="1" r:id="rIdv6-oc39dd29ht7lyryr1p">
               <w:r>
                 <w:rPr>
                   <w:rStyle w:val="Hyperlink"/>
@@ -2086,7 +2086,7 @@
               </w:rPr>
               <w:t xml:space="preserve"> (</w:t>
             </w:r>
-            <w:hyperlink w:history="1" r:id="rIdrkeygr6dd1zdlb6aujeka">
+            <w:hyperlink w:history="1" r:id="rId0gnvx4i3fkuivnvtyvp18">
               <w:r>
                 <w:rPr>
                   <w:rStyle w:val="Hyperlink"/>
@@ -2107,7 +2107,7 @@
               </w:rPr>
               <w:t xml:space="preserve"> with </w:t>
             </w:r>
-            <w:hyperlink w:history="1" r:id="rIdocycjdjbaksqvtr1h7vzh">
+            <w:hyperlink w:history="1" r:id="rId0lgijeyqim43w8gyubvtu">
               <w:r>
                 <w:rPr>
                   <w:rStyle w:val="Hyperlink"/>
@@ -2128,7 +2128,7 @@
               </w:rPr>
               <w:t xml:space="preserve">, beside </w:t>
             </w:r>
-            <w:hyperlink w:history="1" r:id="rIdevafdiqmtpxpk53p7u2hr">
+            <w:hyperlink w:history="1" r:id="rIdaklykxdkscyixfsodyatk">
               <w:r>
                 <w:rPr>
                   <w:rStyle w:val="Hyperlink"/>
@@ -2788,7 +2788,7 @@
               </w:rPr>
               <w:t xml:space="preserve">Encrypted files; weights as </w:t>
             </w:r>
-            <w:hyperlink w:history="1" r:id="rIdir1cec4v-sswmes_w2fdx">
+            <w:hyperlink w:history="1" r:id="rId_if7e0gnld-gaqaroohvh">
               <w:r>
                 <w:rPr>
                   <w:rStyle w:val="Hyperlink"/>
@@ -2915,7 +2915,7 @@
               </w:rPr>
               <w:t xml:space="preserve">Tokenizer, scheduler, serving stack (</w:t>
             </w:r>
-            <w:hyperlink w:history="1" r:id="rIdykd7kln0valoqovohshh5">
+            <w:hyperlink w:history="1" r:id="rIdkjv0f9bqsuttgbj6p2wzv">
               <w:r>
                 <w:rPr>
                   <w:rStyle w:val="Hyperlink"/>
@@ -2936,7 +2936,7 @@
               </w:rPr>
               <w:t xml:space="preserve">, </w:t>
             </w:r>
-            <w:hyperlink w:history="1" r:id="rIdau_xuagcpd-qd19fk3coq">
+            <w:hyperlink w:history="1" r:id="rIdof4kxymfrmoumuoj_wywi">
               <w:r>
                 <w:rPr>
                   <w:rStyle w:val="Hyperlink"/>
@@ -2957,7 +2957,7 @@
               </w:rPr>
               <w:t xml:space="preserve">, </w:t>
             </w:r>
-            <w:hyperlink w:history="1" r:id="rIdewvjbzfuhjuyjlwue2vwl">
+            <w:hyperlink w:history="1" r:id="rIdatu5vbifh_wqskcrogzlx">
               <w:r>
                 <w:rPr>
                   <w:rStyle w:val="Hyperlink"/>
@@ -2978,7 +2978,7 @@
               </w:rPr>
               <w:t xml:space="preserve">), broker, </w:t>
             </w:r>
-            <w:hyperlink w:history="1" r:id="rIdxx1fm6-xsnzohm-czzcr_">
+            <w:hyperlink w:history="1" r:id="rIdbt59tqkwg72pvaxsuazms">
               <w:r>
                 <w:rPr>
                   <w:rStyle w:val="Hyperlink"/>
@@ -3049,7 +3049,7 @@
               </w:rPr>
               <w:t xml:space="preserve">CPU TEE (Intel TDX, </w:t>
             </w:r>
-            <w:hyperlink w:history="1" r:id="rIdy1alyxro2piaofm-fu4mz">
+            <w:hyperlink w:history="1" r:id="rIdiefnyo1eupduj-gy0re6-">
               <w:r>
                 <w:rPr>
                   <w:rStyle w:val="Hyperlink"/>
@@ -3070,7 +3070,7 @@
               </w:rPr>
               <w:t xml:space="preserve">, </w:t>
             </w:r>
-            <w:hyperlink w:history="1" r:id="rIdrsvjdntb1b1s9jedbli2i">
+            <w:hyperlink w:history="1" r:id="rIdjznpzgt5j9q1kphedc-q3">
               <w:r>
                 <w:rPr>
                   <w:rStyle w:val="Hyperlink"/>
@@ -3303,7 +3303,7 @@
               </w:rPr>
               <w:t xml:space="preserve">PCIe to host, NIC and NVMe; NVLink to peers; </w:t>
             </w:r>
-            <w:hyperlink w:history="1" r:id="rIdw7nn7sqc0b7r0zqg_lycs">
+            <w:hyperlink w:history="1" r:id="rId59v4fvhsyutryqxlfnd09">
               <w:r>
                 <w:rPr>
                   <w:rStyle w:val="Hyperlink"/>
@@ -3324,7 +3324,7 @@
               </w:rPr>
               <w:t xml:space="preserve"> across nodes; </w:t>
             </w:r>
-            <w:hyperlink w:history="1" r:id="rIdgs0rbjbw1hoggwge7mds1">
+            <w:hyperlink w:history="1" r:id="rIdmn8qnjppxmp30zdfbuxjw">
               <w:r>
                 <w:rPr>
                   <w:rStyle w:val="Hyperlink"/>
@@ -3975,7 +3975,7 @@
       <w:r>
         <w:t xml:space="preserve">Station 4 is where the second review point lands. A copy engine moves data using a work order the hardware processes one at a time. A permission check on a work order is the same kind of operation as an IOMMU lookup, the check every server already does when a device touches memory. But a CUDA kernel can also </w:t>
       </w:r>
-      <w:hyperlink w:history="1" r:id="rIdide9ql_hpdl_r1yq0isaj">
+      <w:hyperlink w:history="1" r:id="rIdvcae8ey2qjqzunejb-zt6">
         <w:r>
           <w:rPr>
             <w:rStyle w:val="Hyperlink"/>
@@ -4088,7 +4088,7 @@
       <w:r>
         <w:t xml:space="preserve">So authorization is a transaction in three coordinated steps. This is how </w:t>
       </w:r>
-      <w:hyperlink w:history="1" r:id="rIdw0waeutbidbaeb_8tuqxa">
+      <w:hyperlink w:history="1" r:id="rIdeeiut2kqlwmk3c1s8uvjp">
         <w:r>
           <w:rPr>
             <w:rStyle w:val="Hyperlink"/>
@@ -4102,7 +4102,7 @@
       <w:r>
         <w:t xml:space="preserve">, </w:t>
       </w:r>
-      <w:hyperlink w:history="1" r:id="rIdg-4rlxtxsikt8ahgx8f_n">
+      <w:hyperlink w:history="1" r:id="rId49ldnm-volgds1edngfkw">
         <w:r>
           <w:rPr>
             <w:rStyle w:val="Hyperlink"/>
@@ -4116,7 +4116,7 @@
       <w:r>
         <w:t xml:space="preserve"> and </w:t>
       </w:r>
-      <w:hyperlink w:history="1" r:id="rId3cntbi_mcxrpkop55iagz">
+      <w:hyperlink w:history="1" r:id="rIdfi7mthtn8itxpudy5c4yg">
         <w:r>
           <w:rPr>
             <w:rStyle w:val="Hyperlink"/>
@@ -4404,7 +4404,7 @@
       <w:r>
         <w:t xml:space="preserve"> The Layer 4 control plane: a default-deny rulebook signed by the governance root, keyed on the software fingerprint (what code is running, never which chip), with typed limits, witness requirements, rate limits, budgets and human holds. It is software today (</w:t>
       </w:r>
-      <w:hyperlink w:history="1" r:id="rId9z1g4nmoj7tcjzokcxsoc">
+      <w:hyperlink w:history="1" r:id="rIdczaucs7yucjnomzy5nqto">
         <w:r>
           <w:rPr>
             <w:rStyle w:val="Hyperlink"/>
@@ -4514,7 +4514,7 @@
       <w:r>
         <w:t xml:space="preserve"> field, is ignored, because the rulebook picks the rule from the fingerprint, the action and the limited fields, and from nothing else. The </w:t>
       </w:r>
-      <w:hyperlink w:history="1" r:id="rIdmjhbr9quo5b3ks4dmot-a">
+      <w:hyperlink w:history="1" r:id="rIdmb013vft5uuudrbj7txpn">
         <w:r>
           <w:rPr>
             <w:rStyle w:val="Hyperlink"/>
@@ -4551,7 +4551,7 @@
       <w:r>
         <w:t xml:space="preserve"> Observers (the </w:t>
       </w:r>
-      <w:hyperlink w:history="1" r:id="rIdrxq6-fwgk2kfio32g7mxm">
+      <w:hyperlink w:history="1" r:id="rId1rnpeiblqxjrsb8l1vld8">
         <w:r>
           <w:rPr>
             <w:rStyle w:val="Hyperlink"/>
@@ -4565,7 +4565,7 @@
       <w:r>
         <w:t xml:space="preserve"> repo's early-warning lane; </w:t>
       </w:r>
-      <w:hyperlink w:history="1" r:id="rIdxkr9eyu27dklaudcthp7y">
+      <w:hyperlink w:history="1" r:id="rIdlnrxvden2o0c0ilg71-6i">
         <w:r>
           <w:rPr>
             <w:rStyle w:val="Hyperlink"/>
@@ -4576,7 +4576,7 @@
       <w:r>
         <w:t xml:space="preserve"> on the DPU) and the provenance registry (the </w:t>
       </w:r>
-      <w:hyperlink w:history="1" r:id="rId207ghc_leq-4rhm5tcrmm">
+      <w:hyperlink w:history="1" r:id="rIdb6u4je1aluajxxq-giocj">
         <w:r>
           <w:rPr>
             <w:rStyle w:val="Hyperlink"/>
@@ -5943,7 +5943,7 @@
       <w:r>
         <w:t xml:space="preserve">The action side is the guarantee, and it is the half that exists today: the gate, the ledger and the comparator run in the reference stack, and the five demonstrations my colleague asked for are its tests. </w:t>
       </w:r>
-      <w:hyperlink w:history="1" r:id="rIdeawovag4vozrxjhnwjqvm">
+      <w:hyperlink w:history="1" r:id="rIdactewr8rtozjyblefvo2_">
         <w:r>
           <w:rPr>
             <w:rStyle w:val="Hyperlink"/>
@@ -5984,7 +5984,7 @@
       <w:r>
         <w:t xml:space="preserve">J. P. Anderson, </w:t>
       </w:r>
-      <w:hyperlink w:history="1" r:id="rId44ejt5azfq5_zihbmvqmo">
+      <w:hyperlink w:history="1" r:id="rIdv3lyohb_moctvnoylvrqi">
         <w:r>
           <w:rPr>
             <w:rStyle w:val="Hyperlink"/>
@@ -6007,7 +6007,7 @@
         </w:numPr>
         <w:spacing w:after="100" w:line="276" w:lineRule="auto"/>
       </w:pPr>
-      <w:hyperlink w:history="1" r:id="rIdsbj_qexxdrqssdsmcd2uo">
+      <w:hyperlink w:history="1" r:id="rIdm7o8pw_aq0rdrabbt5koa">
         <w:r>
           <w:rPr>
             <w:rStyle w:val="Hyperlink"/>
@@ -6018,7 +6018,7 @@
       <w:r>
         <w:t xml:space="preserve"> and </w:t>
       </w:r>
-      <w:hyperlink w:history="1" r:id="rIdtlgfe7qfg-cashwdqm4c5">
+      <w:hyperlink w:history="1" r:id="rIdbhbsetedtujcmcj9vtrz6">
         <w:r>
           <w:rPr>
             <w:rStyle w:val="Hyperlink"/>
@@ -6042,7 +6042,7 @@
       <w:r>
         <w:t xml:space="preserve">D. Dalrymple et al., </w:t>
       </w:r>
-      <w:hyperlink w:history="1" r:id="rIduuwcagcghjjwszfj79fru">
+      <w:hyperlink w:history="1" r:id="rId049ja59iyx9oabawn7ndc">
         <w:r>
           <w:rPr>
             <w:rStyle w:val="Hyperlink"/>
@@ -6065,7 +6065,7 @@
         </w:numPr>
         <w:spacing w:after="100" w:line="276" w:lineRule="auto"/>
       </w:pPr>
-      <w:hyperlink w:history="1" r:id="rId4ttjci8xfsstwbc41xb-y">
+      <w:hyperlink w:history="1" r:id="rIdppfg7zoilm1pl7yy87dsn">
         <w:r>
           <w:rPr>
             <w:rStyle w:val="Hyperlink"/>
@@ -6086,7 +6086,7 @@
         </w:numPr>
         <w:spacing w:after="100" w:line="276" w:lineRule="auto"/>
       </w:pPr>
-      <w:hyperlink w:history="1" r:id="rIdspwvhpp18b26oftbu5ftm">
+      <w:hyperlink w:history="1" r:id="rId2fl32t5qkhrfln1odp0rn">
         <w:r>
           <w:rPr>
             <w:rStyle w:val="Hyperlink"/>
@@ -6109,7 +6109,7 @@
         </w:numPr>
         <w:spacing w:after="100" w:line="276" w:lineRule="auto"/>
       </w:pPr>
-      <w:hyperlink w:history="1" r:id="rIdrryumetkhdqczwaeai2ff">
+      <w:hyperlink w:history="1" r:id="rIdyvqu9xca73vlsqrkipyns">
         <w:r>
           <w:rPr>
             <w:rStyle w:val="Hyperlink"/>
@@ -6120,7 +6120,7 @@
       <w:r>
         <w:t xml:space="preserve"> and </w:t>
       </w:r>
-      <w:hyperlink w:history="1" r:id="rIdjr5u3vogr_yd41xqjmhwu">
+      <w:hyperlink w:history="1" r:id="rId7orw3tc0evdsrdm65b-iw">
         <w:r>
           <w:rPr>
             <w:rStyle w:val="Hyperlink"/>
@@ -6131,7 +6131,7 @@
       <w:r>
         <w:t xml:space="preserve"> documentation; </w:t>
       </w:r>
-      <w:hyperlink w:history="1" r:id="rIdhzdxlzzqpdmyfkppytkd0">
+      <w:hyperlink w:history="1" r:id="rId2pkvpoybyjhmzi1ztavqi">
         <w:r>
           <w:rPr>
             <w:rStyle w:val="Hyperlink"/>
@@ -6142,7 +6142,7 @@
       <w:r>
         <w:t xml:space="preserve">; </w:t>
       </w:r>
-      <w:hyperlink w:history="1" r:id="rIdxnjunefb3zf6njcuopkx9">
+      <w:hyperlink w:history="1" r:id="rIdqay3te5aybe980-eplnx6">
         <w:r>
           <w:rPr>
             <w:rStyle w:val="Hyperlink"/>
@@ -6153,7 +6153,7 @@
       <w:r>
         <w:t xml:space="preserve">, </w:t>
       </w:r>
-      <w:hyperlink w:history="1" r:id="rId5ukhxoyci1igjkcw2eub1">
+      <w:hyperlink w:history="1" r:id="rIdsc_e7axytt31riazf8jt0">
         <w:r>
           <w:rPr>
             <w:rStyle w:val="Hyperlink"/>
@@ -6164,7 +6164,7 @@
       <w:r>
         <w:t xml:space="preserve">, </w:t>
       </w:r>
-      <w:hyperlink w:history="1" r:id="rIdmcnrbumtm3g6ai9uxbqz5">
+      <w:hyperlink w:history="1" r:id="rIdmnup8uoq3sovlbfi-pyfu">
         <w:r>
           <w:rPr>
             <w:rStyle w:val="Hyperlink"/>
@@ -6185,7 +6185,7 @@
         </w:numPr>
         <w:spacing w:after="100" w:line="276" w:lineRule="auto"/>
       </w:pPr>
-      <w:hyperlink w:history="1" r:id="rIdv8gex28ygeg36h29ms_cl">
+      <w:hyperlink w:history="1" r:id="rIdqg51dpai7wmw9uigkwrzn">
         <w:r>
           <w:rPr>
             <w:rStyle w:val="Hyperlink"/>
@@ -6196,7 +6196,7 @@
       <w:r>
         <w:t xml:space="preserve"> and </w:t>
       </w:r>
-      <w:hyperlink w:history="1" r:id="rIdyz5hm_j7-urofcxlbkanz">
+      <w:hyperlink w:history="1" r:id="rIdr3n40pgptz3kxixohv9wr">
         <w:r>
           <w:rPr>
             <w:rStyle w:val="Hyperlink"/>
@@ -6220,7 +6220,7 @@
       <w:r>
         <w:t xml:space="preserve">This repository: </w:t>
       </w:r>
-      <w:hyperlink w:history="1" r:id="rIdwzugfileekrs7fevwaggw">
+      <w:hyperlink w:history="1" r:id="rIdh-rdnhidryciocrn7wpbo">
         <w:r>
           <w:rPr>
             <w:rStyle w:val="Hyperlink"/>
@@ -6234,7 +6234,7 @@
       <w:r>
         <w:t xml:space="preserve">, the design as a specification, with the message formats as appendices; </w:t>
       </w:r>
-      <w:hyperlink w:history="1" r:id="rIdumuay0yffa6fclezvh6ag">
+      <w:hyperlink w:history="1" r:id="rIda3mxjhmuym3aefurh3wg7">
         <w:r>
           <w:rPr>
             <w:rStyle w:val="Hyperlink"/>
@@ -6248,7 +6248,7 @@
       <w:r>
         <w:t xml:space="preserve">, the experiment program; </w:t>
       </w:r>
-      <w:hyperlink w:history="1" r:id="rIdwvmsvlatysm_bn4f4yzbi">
+      <w:hyperlink w:history="1" r:id="rIdmbiwykio5kwm09ezx0hfs">
         <w:r>
           <w:rPr>
             <w:rStyle w:val="Hyperlink"/>
@@ -6262,7 +6262,7 @@
       <w:r>
         <w:t xml:space="preserve">, the review and what changed; the code: </w:t>
       </w:r>
-      <w:hyperlink w:history="1" r:id="rIdam1pu4y-slx1obqb6l59i">
+      <w:hyperlink w:history="1" r:id="rIdjh5euybwbt8oy1inzyekm">
         <w:r>
           <w:rPr>
             <w:rStyle w:val="Hyperlink"/>
@@ -6276,7 +6276,7 @@
       <w:r>
         <w:t xml:space="preserve">, </w:t>
       </w:r>
-      <w:hyperlink w:history="1" r:id="rIdbsqepuybglvdtmexteoc5">
+      <w:hyperlink w:history="1" r:id="rIdozgbcupyekxrobgkrje_3">
         <w:r>
           <w:rPr>
             <w:rStyle w:val="Hyperlink"/>
@@ -6290,7 +6290,7 @@
       <w:r>
         <w:t xml:space="preserve">, </w:t>
       </w:r>
-      <w:hyperlink w:history="1" r:id="rIdap4r1avpczkn3p77crexb">
+      <w:hyperlink w:history="1" r:id="rIdeefb2kfvjhr5uw88bf9ol">
         <w:r>
           <w:rPr>
             <w:rStyle w:val="Hyperlink"/>
@@ -6304,7 +6304,7 @@
       <w:r>
         <w:t xml:space="preserve">, </w:t>
       </w:r>
-      <w:hyperlink w:history="1" r:id="rId0-jtjneylebmastdqflhr">
+      <w:hyperlink w:history="1" r:id="rIdmrg-9mr1zaejm6jmmhdc5">
         <w:r>
           <w:rPr>
             <w:rStyle w:val="Hyperlink"/>
@@ -6331,7 +6331,7 @@
       <w:r>
         <w:t xml:space="preserve">The companion lanes: </w:t>
       </w:r>
-      <w:hyperlink w:history="1" r:id="rId_0amfpyacsiiizasu8qzw">
+      <w:hyperlink w:history="1" r:id="rId0u149dselx55hhe72f06t">
         <w:r>
           <w:rPr>
             <w:rStyle w:val="Hyperlink"/>
@@ -6345,7 +6345,7 @@
       <w:r>
         <w:t xml:space="preserve"> (observers) and </w:t>
       </w:r>
-      <w:hyperlink w:history="1" r:id="rIdzps_6dlomnjlklqyaf0ze">
+      <w:hyperlink w:history="1" r:id="rIdzd_fdqsfc9rnmiv3kj5ks">
         <w:r>
           <w:rPr>
             <w:rStyle w:val="Hyperlink"/>
@@ -6398,7 +6398,7 @@
           <w:sz w:val="18"/>
           <w:szCs w:val="18"/>
         </w:rPr>
-        <w:t xml:space="preserve">cd hardware-and-silicon &amp;&amp; ./run.sh    # 51 tests, 75 attacks, 12 baselines, under a minute</w:t>
+        <w:t xml:space="preserve">cd hardware-and-silicon &amp;&amp; ./run.sh    # 56 tests, 75 attacks, 12 baselines, under a minute</w:t>
       </w:r>
     </w:p>
     <w:p>

</xml_diff>